<commit_message>
Add Mlyuka et al. (2022) as the qualitative study
Mlyuka et al. is a fully qualitative case study, so it replaces the
qualitative strand of Namisango et al., which becomes a supporting
comparison. Adds a themes figure, updates Table 1, figure numbering,
appendix rationale, and the reference list.

Co-Authored-By: Claude Opus 5.5 <noreply@anthropic.com>
Claude-Session: https://claude.ai/code/session_01XnYwi52cCfyVyiDXeuekrB
</commit_message>
<xml_diff>
--- a/Research_Lifecycle_Three_Studies.docx
+++ b/Research_Lifecycle_Three_Studies.docx
@@ -119,7 +119,7 @@
           <w:b w:val="0"/>
           <w:i w:val="0"/>
         </w:rPr>
-        <w:t>, which examines semiconductor manufacturing equipment providers and their suppliers. The qualitative approach is illustrated by the document review and group interview strand of Namisango et al. (2017), the quantitative approach by the analytical model of Kouvelis et al. (2023), and the mixed methods approach by Asamoah et al. (2021). Two further studies, Singh et al. (2026) and Bimha et al. (2019), provide supporting comparisons. Table 1 and Figure 1 summarize the three lifecycles.</w:t>
+        <w:t>, which examines semiconductor manufacturing equipment providers and their suppliers. The qualitative approach is illustrated by Mlyuka et al. (2022), the quantitative approach by the analytical model of Kouvelis et al. (2023), and the mixed methods approach by Asamoah et al. (2021). Three further studies, Namisango et al. (2017), Singh et al. (2026), and Bimha et al. (2019), provide supporting comparisons. Table 1 and Figure 1 summarize the three lifecycles.</w:t>
       </w:r>
     </w:p>
     <w:p>
@@ -132,7 +132,7 @@
           <w:b/>
           <w:i w:val="0"/>
         </w:rPr>
-        <w:t>Qualitative Approach: Namisango et al. (2017)</w:t>
+        <w:t>Qualitative Approach: Mlyuka et al. (2022)</w:t>
       </w:r>
     </w:p>
     <w:p>
@@ -157,7 +157,7 @@
           <w:b w:val="0"/>
           <w:i w:val="0"/>
         </w:rPr>
-        <w:t>Namisango et al. (2017) addressed the problem that patients in Southern Africa lack reliable access to opioids for clinical pain management despite clear medical need. The purpose was to identify country-specific and regional barriers to opioid access and administration and to generate recommendations for improving pain management. The guiding questions asked how practices, legislation, the supply chain, and regulation restrict availability. Consistent with exploratory inquiry, the qualitative strand stated no hypotheses.</w:t>
+        <w:t>Mlyuka et al. (2022) addressed the limited availability of hydroxyurea, the main disease-modifying medicine for sickle cell disease, in Tanzania, even though Sub-Saharan Africa carries about 75% of the global disease burden. No Tanzanian manufacturer produced the drug, and only one imported brand was registered. The purpose was to explore the barriers to and facilitators of hydroxyurea availability from the perspective of the upstream supply chain. The guiding question asked what prevents and what enables manufacturers, importers, and regulators to make the medicine available. Consistent with exploratory qualitative inquiry, the study stated no hypotheses.</w:t>
       </w:r>
     </w:p>
     <w:p>
@@ -182,7 +182,7 @@
           <w:b w:val="0"/>
           <w:i w:val="0"/>
         </w:rPr>
-        <w:t>The overall study used a parallel mixed methods design across Mozambique, Swaziland, and Zimbabwe, and this paper examines its qualitative strand. That strand fit the problem because the barriers were embedded in laws, institutional practices, and stakeholder experience rather than in measurable variables. The design was multi-sectoral and cross-national, drawing stakeholders from across the opioid supply chain in each country (Namisango et al., 2017).</w:t>
+        <w:t>A qualitative methodology fit the problem because the barriers lay in perceptions, business judgments, and regulatory understanding rather than in measurable variables. The design was a qualitative case study with purposive sampling of 10 participants who each had more than three years of experience in pharmaceutical manufacturing, importation, or regulation (Mlyuka et al., 2022).</w:t>
       </w:r>
     </w:p>
     <w:p>
@@ -207,7 +207,7 @@
           <w:b w:val="0"/>
           <w:i w:val="0"/>
         </w:rPr>
-        <w:t>The qualitative instruments were a structured review of national regulatory and policy documents and group interview guides used with stakeholders. Documents and interview data were analyzed to identify barriers at each level of the supply chain, and the results were compared across the three countries and with a parallel key informant survey (Namisango et al., 2017).</w:t>
+        <w:t>The instrument was a semistructured interview guide used in in-depth interviews, with recruitment continuing until data saturation. Interviews were audio-recorded and transcribed verbatim, and the transcripts were analyzed thematically, producing two themes: barriers and opportunities (Mlyuka et al., 2022).</w:t>
       </w:r>
     </w:p>
     <w:p>
@@ -232,7 +232,7 @@
           <w:b w:val="0"/>
           <w:i w:val="0"/>
         </w:rPr>
-        <w:t>The study identified overly restrictive controlled-medicines laws, stigmatizing language in key documents, inaccurate estimation of opioid consumption, knowledge gaps about distribution, storage, and prescribing, a critical shortage of prescribers, and high out-of-pocket costs for patients (Namisango et al., 2017). The authors recommended updating policies and laws and addressing barriers at every level of the supply chain (see Figure 2).</w:t>
+        <w:t>Inadequate understanding of sickle cell disease, hydroxyurea, and the national orphan drug regulation heightened concern about a small market and weak investment viability, which discouraged local manufacturing and importation. Participants nonetheless viewed the regulator as supportive and saw existing policies as a starting point for improving availability (Mlyuka et al., 2022; see Figure 2). Namisango et al. (2017) reached a similar conclusion for opioids in Mozambique, Swaziland, and Zimbabwe, where document review and group interviews revealed restrictive laws, inaccurate estimation of consumption, and a shortage of prescribers (see Figure 3).</w:t>
       </w:r>
     </w:p>
     <w:p>
@@ -257,7 +257,7 @@
           <w:b w:val="0"/>
           <w:i w:val="0"/>
         </w:rPr>
-        <w:t>Group interviews with officials and clinicians require ethical clearance, informed consent, and protection of participants who may criticize their own institutions; because group members hear one another, confidentiality can only be partly assured. The legal implications are central: national narcotics laws and international drug control obligations shaped the supply chain itself, so the researchers had to report legal barriers accurately without encouraging noncompliance.</w:t>
+        <w:t>Interviewing a small number of identifiable industry and regulatory professionals requires ethical clearance, informed consent, and careful de-identification, because commercial strategies and regulatory opinions are sensitive. Legally, the findings turn on how orphan drug and medicines registration rules are understood and applied; Namisango et al. (2017) likewise showed that national narcotics laws shaped the opioid supply chain, so researchers must report legal barriers accurately without encouraging noncompliance.</w:t>
       </w:r>
     </w:p>
     <w:p>
@@ -345,7 +345,7 @@
           <w:b w:val="0"/>
           <w:i w:val="0"/>
         </w:rPr>
-        <w:t>In modeling research, the instrument is the mathematical model: decision variables (due date and order quantity), random variables (activity time and material consumption, which may be positively or negatively correlated), and cost parameters such as late-delivery penalties. Kouvelis et al. (2023) analyzed the model by deriving optimal policies and examining how they change as uncertainty, penalties, and contract prices change (see Figure 3).</w:t>
+        <w:t>In modeling research, the instrument is the mathematical model: decision variables (due date and order quantity), random variables (activity time and material consumption, which may be positively or negatively correlated), and cost parameters such as late-delivery penalties. Kouvelis et al. (2023) analyzed the model by deriving optimal policies and examining how they change as uncertainty, penalties, and contract prices change (see Figure 4).</w:t>
       </w:r>
     </w:p>
     <w:p>
@@ -483,7 +483,7 @@
           <w:b w:val="0"/>
           <w:i w:val="0"/>
         </w:rPr>
-        <w:t>The instruments were a survey questionnaire completed by 86 providers, an observation checklist applied at 12 cold chain sites, and interview guides for 11 key informants (see Figure 4). Quantitative data were analyzed with descriptive statistics and correlation analysis, and interview data were coded inductively into themes (Asamoah et al., 2021).</w:t>
+        <w:t>The instruments were a survey questionnaire completed by 86 providers, an observation checklist applied at 12 cold chain sites, and interview guides for 11 key informants (see Figure 5). Quantitative data were analyzed with descriptive statistics and correlation analysis, and interview data were coded inductively into themes (Asamoah et al., 2021).</w:t>
       </w:r>
     </w:p>
     <w:p>
@@ -558,7 +558,7 @@
           <w:b w:val="0"/>
           <w:i w:val="0"/>
         </w:rPr>
-        <w:t>The research lifecycle changes with methodology. Namisango et al. (2017) built understanding inductively from documents and stakeholders, Kouvelis et al. (2023) deduced optimal decisions from a formal model, and Asamoah et al. (2021) combined measurement with lived experience. The findings converge: shortages arise from weak estimation and visibility, rigid rules, limited capacity, and fragile logistics, and they are reduced by buffers, flexible supplier terms, and monitoring.</w:t>
+        <w:t>The research lifecycle changes with methodology. Mlyuka et al. (2022) built understanding inductively from the experience of supply chain actors, Kouvelis et al. (2023) deduced optimal decisions from a formal model, and Asamoah et al. (2021) combined measurement with lived experience. The findings converge: shortages arise from weak estimation and visibility, uncertain market signals, rigid or poorly understood rules, limited capacity, and fragile logistics, and they are reduced by buffers, flexible supplier terms, and monitoring.</w:t>
       </w:r>
     </w:p>
     <w:p>
@@ -570,7 +570,7 @@
           <w:b w:val="0"/>
           <w:i w:val="0"/>
         </w:rPr>
-        <w:t>For my proposed qualitative case study, Namisango et al. (2017) offer a model for combining document review with stakeholder interviews; Kouvelis et al. (2023) and Singh et al. (2026) provide constructs and analytics for interpreting inventory, time buffers, and supplier flexibility during ramp-up; and Asamoah et al. (2021) show how observation can verify what participants report. Because semiconductor firms operate under nondisclosure agreements and export controls, IRB approval, informed consent, de-identification of firms, and careful screening of proprietary documents will be essential. The Appendix translates these findings into a shortage risk-scoring algorithm.</w:t>
+        <w:t>For my proposed qualitative case study, Mlyuka et al. (2022) offer a direct model: purposive sampling of experienced upstream actors, in-depth interviews to saturation, and thematic analysis, which Namisango et al. (2017) show can be strengthened by document review; Kouvelis et al. (2023) and Singh et al. (2026) provide constructs and analytics for interpreting inventory, time buffers, and supplier flexibility during ramp-up; and Asamoah et al. (2021) show how observation can verify what participants report. Because semiconductor firms operate under nondisclosure agreements and export controls, IRB approval, informed consent, de-identification of firms, and careful screening of proprietary documents will be essential. The Appendix translates these findings into a shortage risk-scoring algorithm.</w:t>
       </w:r>
     </w:p>
     <w:p>
@@ -652,7 +652,7 @@
                 <w:color w:val="FFFFFF"/>
                 <w:sz w:val="19"/>
               </w:rPr>
-              <w:t>Namisango et al. (2017)</w:t>
+              <w:t>Mlyuka et al. (2022)</w:t>
             </w:r>
           </w:p>
         </w:tc>
@@ -735,7 +735,7 @@
                 <w:b w:val="0"/>
                 <w:sz w:val="19"/>
               </w:rPr>
-              <w:t>Qualitative strand of a parallel mixed methods study</w:t>
+              <w:t>Qualitative (case study)</w:t>
             </w:r>
           </w:p>
         </w:tc>
@@ -816,7 +816,7 @@
                 <w:b w:val="0"/>
                 <w:sz w:val="19"/>
               </w:rPr>
-              <w:t>Barriers to opioid access and supply in Southern Africa</w:t>
+              <w:t>Limited hydroxyurea availability in Tanzania</w:t>
             </w:r>
           </w:p>
         </w:tc>
@@ -897,7 +897,7 @@
                 <w:b w:val="0"/>
                 <w:sz w:val="19"/>
               </w:rPr>
-              <w:t>How practices, law, supply chain, and regulation limit access; no hypotheses</w:t>
+              <w:t>What hinders and enables upstream availability; no hypotheses</w:t>
             </w:r>
           </w:p>
         </w:tc>
@@ -978,7 +978,7 @@
                 <w:b w:val="0"/>
                 <w:sz w:val="19"/>
               </w:rPr>
-              <w:t>Multi-sectoral, cross-national (3 countries)</w:t>
+              <w:t>Case study; purposive sample of 10 experienced actors</w:t>
             </w:r>
           </w:p>
         </w:tc>
@@ -1059,7 +1059,7 @@
                 <w:b w:val="0"/>
                 <w:sz w:val="19"/>
               </w:rPr>
-              <w:t>Policy document review, group interview guides</w:t>
+              <w:t>Semistructured in-depth interview guide</w:t>
             </w:r>
           </w:p>
         </w:tc>
@@ -1140,7 +1140,7 @@
                 <w:b w:val="0"/>
                 <w:sz w:val="19"/>
               </w:rPr>
-              <w:t>Document and interview analysis by supply chain level</w:t>
+              <w:t>Verbatim transcription; thematic analysis (2 themes)</w:t>
             </w:r>
           </w:p>
         </w:tc>
@@ -1221,7 +1221,7 @@
                 <w:b w:val="0"/>
                 <w:sz w:val="19"/>
               </w:rPr>
-              <w:t>Restrictive laws, poor estimation, prescriber shortage, high costs</w:t>
+              <w:t>Awareness and regulation gaps; market viability concerns; supportive regulator</w:t>
             </w:r>
           </w:p>
         </w:tc>
@@ -1302,7 +1302,7 @@
                 <w:b w:val="0"/>
                 <w:sz w:val="19"/>
               </w:rPr>
-              <w:t>Consent, partial confidentiality, narcotics law</w:t>
+              <w:t>Consent, de-identification, orphan drug regulation</w:t>
             </w:r>
           </w:p>
         </w:tc>
@@ -1359,7 +1359,7 @@
         <w:t xml:space="preserve">Note. </w:t>
       </w:r>
       <w:r>
-        <w:t>Compiled by the author from Namisango et al. (2017), Kouvelis et al. (2023), and Asamoah et al. (2021). Column colors match Figure 1: blue = qualitative, orange = quantitative, green = mixed methods.</w:t>
+        <w:t>Compiled by the author from Mlyuka et al. (2022), Kouvelis et al. (2023), and Asamoah et al. (2021). Column colors match Figure 1: blue = qualitative, orange = quantitative, green = mixed methods.</w:t>
       </w:r>
     </w:p>
     <w:p>
@@ -1439,7 +1439,7 @@
         <w:t xml:space="preserve">Note. </w:t>
       </w:r>
       <w:r>
-        <w:t>Each row traces one study from problem to findings. Compiled from Namisango et al. (2017), Kouvelis et al. (2023), and Asamoah et al. (2021).</w:t>
+        <w:t>Each row traces one study from problem to findings. Compiled from Mlyuka et al. (2022), Kouvelis et al. (2023), and Asamoah et al. (2021).</w:t>
       </w:r>
     </w:p>
     <w:p>
@@ -1464,6 +1464,86 @@
           <w:b w:val="0"/>
           <w:i/>
         </w:rPr>
+        <w:t>Themes on Barriers to and Facilitators of Hydroxyurea Availability</w:t>
+      </w:r>
+    </w:p>
+    <w:p>
+      <w:pPr>
+        <w:keepNext/>
+        <w:spacing w:line="240" w:lineRule="auto"/>
+        <w:jc w:val="center"/>
+      </w:pPr>
+      <w:r>
+        <w:drawing>
+          <wp:inline xmlns:a="http://schemas.openxmlformats.org/drawingml/2006/main" xmlns:pic="http://schemas.openxmlformats.org/drawingml/2006/picture">
+            <wp:extent cx="5943600" cy="2501886"/>
+            <wp:docPr id="2" name="Picture 2"/>
+            <wp:cNvGraphicFramePr>
+              <a:graphicFrameLocks noChangeAspect="1"/>
+            </wp:cNvGraphicFramePr>
+            <a:graphic>
+              <a:graphicData uri="http://schemas.openxmlformats.org/drawingml/2006/picture">
+                <pic:pic>
+                  <pic:nvPicPr>
+                    <pic:cNvPr id="0" name="fig2_mlyuka.png"/>
+                    <pic:cNvPicPr/>
+                  </pic:nvPicPr>
+                  <pic:blipFill>
+                    <a:blip r:embed="rId11"/>
+                    <a:stretch>
+                      <a:fillRect/>
+                    </a:stretch>
+                  </pic:blipFill>
+                  <pic:spPr>
+                    <a:xfrm>
+                      <a:off x="0" y="0"/>
+                      <a:ext cx="5943600" cy="2501886"/>
+                    </a:xfrm>
+                    <a:prstGeom prst="rect"/>
+                  </pic:spPr>
+                </pic:pic>
+              </a:graphicData>
+            </a:graphic>
+          </wp:inline>
+        </w:drawing>
+      </w:r>
+    </w:p>
+    <w:p>
+      <w:pPr>
+        <w:spacing w:line="480" w:lineRule="auto"/>
+      </w:pPr>
+      <w:r>
+        <w:rPr>
+          <w:i/>
+        </w:rPr>
+        <w:t xml:space="preserve">Note. </w:t>
+      </w:r>
+      <w:r>
+        <w:t>Themes reported by Mlyuka et al. (2022) from in-depth interviews with pharmaceutical manufacturers, importers, and regulators. TMDA = Tanzania Medicines and Medical Devices Authority.</w:t>
+      </w:r>
+    </w:p>
+    <w:p>
+      <w:pPr>
+        <w:keepNext/>
+        <w:pageBreakBefore/>
+      </w:pPr>
+      <w:r>
+        <w:rPr>
+          <w:b/>
+          <w:i w:val="0"/>
+        </w:rPr>
+        <w:t>Figure 3</w:t>
+      </w:r>
+    </w:p>
+    <w:p>
+      <w:pPr>
+        <w:keepNext/>
+      </w:pPr>
+      <w:r>
+        <w:rPr>
+          <w:b w:val="0"/>
+          <w:i/>
+        </w:rPr>
         <w:t>Barriers to Opioid Availability Mapped to Supply Chain Stages</w:t>
       </w:r>
     </w:p>
@@ -1477,7 +1557,7 @@
         <w:drawing>
           <wp:inline xmlns:a="http://schemas.openxmlformats.org/drawingml/2006/main" xmlns:pic="http://schemas.openxmlformats.org/drawingml/2006/picture">
             <wp:extent cx="5943600" cy="2180456"/>
-            <wp:docPr id="2" name="Picture 2"/>
+            <wp:docPr id="3" name="Picture 3"/>
             <wp:cNvGraphicFramePr>
               <a:graphicFrameLocks noChangeAspect="1"/>
             </wp:cNvGraphicFramePr>
@@ -1489,7 +1569,7 @@
                     <pic:cNvPicPr/>
                   </pic:nvPicPr>
                   <pic:blipFill>
-                    <a:blip r:embed="rId11"/>
+                    <a:blip r:embed="rId12"/>
                     <a:stretch>
                       <a:fillRect/>
                     </a:stretch>
@@ -1532,7 +1612,7 @@
           <w:b/>
           <w:i w:val="0"/>
         </w:rPr>
-        <w:t>Figure 3</w:t>
+        <w:t>Figure 4</w:t>
       </w:r>
     </w:p>
     <w:p>
@@ -1557,7 +1637,7 @@
         <w:drawing>
           <wp:inline xmlns:a="http://schemas.openxmlformats.org/drawingml/2006/main" xmlns:pic="http://schemas.openxmlformats.org/drawingml/2006/picture">
             <wp:extent cx="5943600" cy="2556979"/>
-            <wp:docPr id="3" name="Picture 3"/>
+            <wp:docPr id="4" name="Picture 4"/>
             <wp:cNvGraphicFramePr>
               <a:graphicFrameLocks noChangeAspect="1"/>
             </wp:cNvGraphicFramePr>
@@ -1569,7 +1649,7 @@
                     <pic:cNvPicPr/>
                   </pic:nvPicPr>
                   <pic:blipFill>
-                    <a:blip r:embed="rId12"/>
+                    <a:blip r:embed="rId13"/>
                     <a:stretch>
                       <a:fillRect/>
                     </a:stretch>
@@ -1612,7 +1692,7 @@
           <w:b/>
           <w:i w:val="0"/>
         </w:rPr>
-        <w:t>Figure 4</w:t>
+        <w:t>Figure 5</w:t>
       </w:r>
     </w:p>
     <w:p>
@@ -1637,7 +1717,7 @@
         <w:drawing>
           <wp:inline xmlns:a="http://schemas.openxmlformats.org/drawingml/2006/main" xmlns:pic="http://schemas.openxmlformats.org/drawingml/2006/picture">
             <wp:extent cx="5943600" cy="2271749"/>
-            <wp:docPr id="4" name="Picture 4"/>
+            <wp:docPr id="5" name="Picture 5"/>
             <wp:cNvGraphicFramePr>
               <a:graphicFrameLocks noChangeAspect="1"/>
             </wp:cNvGraphicFramePr>
@@ -1649,7 +1729,7 @@
                     <pic:cNvPicPr/>
                   </pic:nvPicPr>
                   <pic:blipFill>
-                    <a:blip r:embed="rId13"/>
+                    <a:blip r:embed="rId14"/>
                     <a:stretch>
                       <a:fillRect/>
                     </a:stretch>
@@ -1717,7 +1797,7 @@
           <w:b w:val="0"/>
           <w:i w:val="0"/>
         </w:rPr>
-        <w:t>Algorithm A1 operationalizes the proposed framework. It applies the buffering levers that Kouvelis et al. (2023) identify (inventory, time buffers, and supplier flexibility), builds a shortage mechanism into the calculation as Singh et al. (2026) do, and adds the estimation and monitoring safeguards highlighted by Namisango et al. (2017) and Asamoah et al. (2021). Figure A1 summarizes the steps, and Table A1 and Figure A2 apply the algorithm to illustrative data. The weights are starting assumptions to be calibrated with interview and performance data collected in the proposed study.</w:t>
+        <w:t>Algorithm A1 operationalizes the proposed framework. It applies the buffering levers that Kouvelis et al. (2023) identify (inventory, time buffers, and supplier flexibility), builds a shortage mechanism into the calculation as Singh et al. (2026) do, and adds the estimation and monitoring safeguards highlighted by Namisango et al. (2017) and Asamoah et al. (2021), while its market-signal inputs reflect the investment concerns reported by Mlyuka et al. (2022). Figure A1 summarizes the steps, and Table A1 and Figure A2 apply the algorithm to illustrative data. The weights are starting assumptions to be calibrated with interview and performance data collected in the proposed study.</w:t>
       </w:r>
     </w:p>
     <w:p>
@@ -2149,7 +2229,7 @@
         <w:drawing>
           <wp:inline xmlns:a="http://schemas.openxmlformats.org/drawingml/2006/main" xmlns:pic="http://schemas.openxmlformats.org/drawingml/2006/picture">
             <wp:extent cx="5760720" cy="3436329"/>
-            <wp:docPr id="5" name="Picture 5"/>
+            <wp:docPr id="6" name="Picture 6"/>
             <wp:cNvGraphicFramePr>
               <a:graphicFrameLocks noChangeAspect="1"/>
             </wp:cNvGraphicFramePr>
@@ -2161,7 +2241,7 @@
                     <pic:cNvPicPr/>
                   </pic:nvPicPr>
                   <pic:blipFill>
-                    <a:blip r:embed="rId14"/>
+                    <a:blip r:embed="rId15"/>
                     <a:stretch>
                       <a:fillRect/>
                     </a:stretch>
@@ -4080,7 +4160,7 @@
         <w:drawing>
           <wp:inline xmlns:a="http://schemas.openxmlformats.org/drawingml/2006/main" xmlns:pic="http://schemas.openxmlformats.org/drawingml/2006/picture">
             <wp:extent cx="5486400" cy="2691073"/>
-            <wp:docPr id="6" name="Picture 6"/>
+            <wp:docPr id="7" name="Picture 7"/>
             <wp:cNvGraphicFramePr>
               <a:graphicFrameLocks noChangeAspect="1"/>
             </wp:cNvGraphicFramePr>
@@ -4092,7 +4172,7 @@
                     <pic:cNvPicPr/>
                   </pic:nvPicPr>
                   <pic:blipFill>
-                    <a:blip r:embed="rId15"/>
+                    <a:blip r:embed="rId16"/>
                     <a:stretch>
                       <a:fillRect/>
                     </a:stretch>
@@ -4206,6 +4286,29 @@
           <w:i w:val="0"/>
         </w:rPr>
         <w:t>(11), 3717–3735. https://doi.org/10.1111/poms.14059</w:t>
+      </w:r>
+    </w:p>
+    <w:p>
+      <w:pPr>
+        <w:ind w:left="720" w:hanging="720"/>
+      </w:pPr>
+      <w:r>
+        <w:rPr>
+          <w:i w:val="0"/>
+        </w:rPr>
+        <w:t xml:space="preserve">Mlyuka, H. J., Kilonzi, M., Mutagonda, R. F., Chirande, L., Mikomangwa, W. P., Myemba, D. T., Sambayi, G., Mwakawanga, D. L., Ndunguru, J., Jonathan, A., Makani, J., Ruggajo, P., Minja, I. K., Balandya, E., &amp; Kamuhabwa, A. A. R. (2022). Barriers and facilitators of availability of hydroxyurea for sickle cell disease in Tanzania: A qualitative study of pharmaceutical manufacturers, importers, and regulators. </w:t>
+      </w:r>
+      <w:r>
+        <w:rPr>
+          <w:i/>
+        </w:rPr>
+        <w:t>Healthcare, 10</w:t>
+      </w:r>
+      <w:r>
+        <w:rPr>
+          <w:i w:val="0"/>
+        </w:rPr>
+        <w:t>(11), 2223. https://doi.org/10.3390/healthcare10112223</w:t>
       </w:r>
     </w:p>
     <w:p>

</xml_diff>